<commit_message>
fix num pages in footer
</commit_message>
<xml_diff>
--- a/list_templates/liste.docx
+++ b/list_templates/liste.docx
@@ -373,20 +373,8 @@
                 <w:szCs w:val="18"/>
                 <w:lang w:eastAsia="de-DE"/>
               </w:rPr>
-              <w:t xml:space="preserve">Medikamente, Allergien </w:t>
-            </w:r>
-            <w:proofErr w:type="gramStart"/>
-            <w:r>
-              <w:rPr>
-                <w:rFonts w:eastAsia="Times New Roman" w:cstheme="minorHAnsi"/>
-                <w:color w:val="000000"/>
-                <w:sz w:val="18"/>
-                <w:szCs w:val="18"/>
-                <w:lang w:eastAsia="de-DE"/>
-              </w:rPr>
-              <w:t>o.ä</w:t>
-            </w:r>
-            <w:proofErr w:type="gramEnd"/>
+              <w:t>Medikamente, Allergien o.ä</w:t>
+            </w:r>
           </w:p>
         </w:tc>
       </w:tr>
@@ -1015,6 +1003,140 @@
     </w:tbl>
     <w:p>
       <w:pPr>
+        <w:rPr>
+          <w:rFonts w:cstheme="minorHAnsi"/>
+        </w:rPr>
+      </w:pPr>
+    </w:p>
+    <w:p>
+      <w:pPr>
+        <w:rPr>
+          <w:rFonts w:cstheme="minorHAnsi"/>
+        </w:rPr>
+      </w:pPr>
+    </w:p>
+    <w:p>
+      <w:pPr>
+        <w:rPr>
+          <w:rFonts w:cstheme="minorHAnsi"/>
+        </w:rPr>
+      </w:pPr>
+    </w:p>
+    <w:p>
+      <w:pPr>
+        <w:rPr>
+          <w:rFonts w:cstheme="minorHAnsi"/>
+        </w:rPr>
+      </w:pPr>
+    </w:p>
+    <w:p>
+      <w:pPr>
+        <w:rPr>
+          <w:rFonts w:cstheme="minorHAnsi"/>
+        </w:rPr>
+      </w:pPr>
+    </w:p>
+    <w:p>
+      <w:pPr>
+        <w:rPr>
+          <w:rFonts w:cstheme="minorHAnsi"/>
+        </w:rPr>
+      </w:pPr>
+    </w:p>
+    <w:p>
+      <w:pPr>
+        <w:rPr>
+          <w:rFonts w:cstheme="minorHAnsi"/>
+        </w:rPr>
+      </w:pPr>
+    </w:p>
+    <w:p>
+      <w:pPr>
+        <w:rPr>
+          <w:rFonts w:cstheme="minorHAnsi"/>
+        </w:rPr>
+      </w:pPr>
+    </w:p>
+    <w:p>
+      <w:pPr>
+        <w:rPr>
+          <w:rFonts w:cstheme="minorHAnsi"/>
+        </w:rPr>
+      </w:pPr>
+    </w:p>
+    <w:p>
+      <w:pPr>
+        <w:rPr>
+          <w:rFonts w:cstheme="minorHAnsi"/>
+        </w:rPr>
+      </w:pPr>
+    </w:p>
+    <w:p>
+      <w:pPr>
+        <w:rPr>
+          <w:rFonts w:cstheme="minorHAnsi"/>
+        </w:rPr>
+      </w:pPr>
+    </w:p>
+    <w:p>
+      <w:pPr>
+        <w:rPr>
+          <w:rFonts w:cstheme="minorHAnsi"/>
+        </w:rPr>
+      </w:pPr>
+    </w:p>
+    <w:p>
+      <w:pPr>
+        <w:rPr>
+          <w:rFonts w:cstheme="minorHAnsi"/>
+        </w:rPr>
+      </w:pPr>
+    </w:p>
+    <w:p>
+      <w:pPr>
+        <w:rPr>
+          <w:rFonts w:cstheme="minorHAnsi"/>
+        </w:rPr>
+      </w:pPr>
+    </w:p>
+    <w:p>
+      <w:pPr>
+        <w:rPr>
+          <w:rFonts w:cstheme="minorHAnsi"/>
+        </w:rPr>
+      </w:pPr>
+    </w:p>
+    <w:p>
+      <w:pPr>
+        <w:rPr>
+          <w:rFonts w:cstheme="minorHAnsi"/>
+        </w:rPr>
+      </w:pPr>
+    </w:p>
+    <w:p>
+      <w:pPr>
+        <w:rPr>
+          <w:rFonts w:cstheme="minorHAnsi"/>
+        </w:rPr>
+      </w:pPr>
+    </w:p>
+    <w:p>
+      <w:pPr>
+        <w:rPr>
+          <w:rFonts w:cstheme="minorHAnsi"/>
+        </w:rPr>
+      </w:pPr>
+    </w:p>
+    <w:p>
+      <w:pPr>
+        <w:rPr>
+          <w:rFonts w:cstheme="minorHAnsi"/>
+        </w:rPr>
+      </w:pPr>
+    </w:p>
+    <w:p>
+      <w:pPr>
+        <w:jc w:val="center"/>
         <w:rPr>
           <w:rFonts w:cstheme="minorHAnsi"/>
         </w:rPr>
@@ -1111,21 +1233,14 @@
         <w:r>
           <w:t>/</w:t>
         </w:r>
-        <w:r>
-          <w:fldChar w:fldCharType="begin"/>
-        </w:r>
-        <w:r>
-          <w:instrText>PAGE   \* MERGEFORMAT</w:instrText>
-        </w:r>
-        <w:r>
-          <w:fldChar w:fldCharType="separate"/>
-        </w:r>
-        <w:r>
-          <w:t>1</w:t>
-        </w:r>
-        <w:r>
-          <w:fldChar w:fldCharType="end"/>
-        </w:r>
+        <w:fldSimple w:instr=" NUMPAGES   \* MERGEFORMAT ">
+          <w:r>
+            <w:rPr>
+              <w:noProof/>
+            </w:rPr>
+            <w:t>1</w:t>
+          </w:r>
+        </w:fldSimple>
       </w:p>
     </w:sdtContent>
   </w:sdt>

</xml_diff>